<commit_message>
CV : alternance TSSR, sans date ni tri des tickets
L'objectif devient « Recherche une alternance TSSR - Technicien Superieur
Systemes et Reseaux » : plus de BTS SIO SISR, plus de rentree en fevrier
2027 ni de rythme 3 j / 2 j. La ligne Automatisation perd le tri
automatique de tickets et l'IA appliquee au support, comme sur le site ;
la variante emploi aussi.

Le controle ATS exige desormais « TSSR » dans le CV alternance et
l'interdit dans le CV emploi. La copie du bureau s'appelle
CV-Moussa-Zedira-Alternance-TSSR.pdf. Les liens du site passent en
?v=20261004 pour qu'aucun visiteur ne recoive l'ancien PDF depuis son cache.

Co-Authored-By: Claude Opus 5.5 (1M context) <noreply@anthropic.com>
</commit_message>
<xml_diff>
--- a/cv/CV-Moussa-Zedira.docx
+++ b/cv/CV-Moussa-Zedira.docx
@@ -42,7 +42,7 @@
           <w:color w:val="16181C"/>
           <w:sz w:val="18"/>
         </w:rPr>
-        <w:t>Recherche une alternance en BTS SIO option SISR - rentrée février 2027, 3 jours en entreprise et 2 jours en cours</w:t>
+        <w:t>Recherche une alternance TSSR - Technicien Supérieur Systèmes et Réseaux</w:t>
       </w:r>
     </w:p>
     <w:p>
@@ -227,7 +227,7 @@
           <w:color w:val="33373D"/>
           <w:sz w:val="18"/>
         </w:rPr>
-        <w:t>Scripts Python, workflows n8n, triage automatique de tickets, IA appliquée au support</w:t>
+        <w:t>Scripts Python, PowerShell &amp; Bash, workflows n8n</w:t>
       </w:r>
     </w:p>
     <w:p>

</xml_diff>